<commit_message>
Added template generation improvements for UAT
</commit_message>
<xml_diff>
--- a/backend/templates/Annexure-D (Individual Affidavit)_C1_Template.docx
+++ b/backend/templates/Annexure-D (Individual Affidavit)_C1_Template.docx
@@ -393,7 +393,7 @@
           <w:u w:val="none"/>
           <w:shd w:val="clear" w:color="auto" w:fill="FFFFFF"/>
         </w:rPr>
-        <w:t>[Address C1]</w:t>
+        <w:t>[Address Contact C1]</w:t>
       </w:r>
       <w:r>
         <w:rPr>
@@ -462,14 +462,14 @@
           <w:rFonts w:ascii="Helvetica" w:hAnsi="Helvetica" w:cs="Helvetica"/>
           <w:b/>
         </w:rPr>
-        <w:t>[Name as per DC H1]</w:t>
+        <w:t>[Deceased Names DC]</w:t>
       </w:r>
       <w:r>
         <w:rPr>
           <w:rFonts w:ascii="Helvetica" w:hAnsi="Helvetica" w:cs="Helvetica"/>
           <w:b/>
         </w:rPr>
-        <w:t>, [Name as per DC H2], [Name as per DC H3], [Name as per DC H4]</w:t>
+        <w:t/>
       </w:r>
       <w:r>
         <w:rPr>
@@ -1146,7 +1146,7 @@
                 <w:b/>
                 <w:shd w:val="clear" w:color="auto" w:fill="FFFFFF"/>
               </w:rPr>
-              <w:t>[Address C1]</w:t>
+              <w:t>[Address Contact C1]</w:t>
             </w:r>
           </w:p>
           <w:p>
@@ -1163,7 +1163,7 @@
                 <w:b/>
                 <w:shd w:val="clear" w:color="auto" w:fill="FFFFFF"/>
               </w:rPr>
-              <w:t>[Mobile No C1]</w:t>
+              <w:t/>
             </w:r>
           </w:p>
         </w:tc>
@@ -1269,7 +1269,7 @@
                 <w:b/>
                 <w:shd w:val="clear" w:color="auto" w:fill="FFFFFF"/>
               </w:rPr>
-              <w:t>[Address C2]</w:t>
+              <w:t>[Address Contact C2]</w:t>
             </w:r>
           </w:p>
           <w:p>
@@ -1287,7 +1287,7 @@
                 <w:b/>
                 <w:shd w:val="clear" w:color="auto" w:fill="FFFFFF"/>
               </w:rPr>
-              <w:t>[Mobile No C2]</w:t>
+              <w:t/>
             </w:r>
           </w:p>
           <w:p>
@@ -1408,7 +1408,7 @@
                 <w:b/>
                 <w:shd w:val="clear" w:color="auto" w:fill="FFFFFF"/>
               </w:rPr>
-              <w:t>[Address C3]</w:t>
+              <w:t>[Address Contact C3]</w:t>
             </w:r>
           </w:p>
           <w:p>
@@ -1425,7 +1425,7 @@
                 <w:b/>
                 <w:shd w:val="clear" w:color="auto" w:fill="FFFFFF"/>
               </w:rPr>
-              <w:t>[Mobile No C3]</w:t>
+              <w:t/>
             </w:r>
           </w:p>
         </w:tc>
@@ -1543,7 +1543,7 @@
                 <w:b/>
                 <w:shd w:val="clear" w:color="auto" w:fill="FFFFFF"/>
               </w:rPr>
-              <w:t>[Address LH1]</w:t>
+              <w:t>[Address Contact LH1]</w:t>
             </w:r>
           </w:p>
           <w:p>
@@ -1560,7 +1560,7 @@
                 <w:b/>
                 <w:shd w:val="clear" w:color="auto" w:fill="FFFFFF"/>
               </w:rPr>
-              <w:t>[Mobile No LH1]</w:t>
+              <w:t/>
             </w:r>
           </w:p>
           <w:p>
@@ -1685,7 +1685,7 @@
                 <w:b/>
                 <w:shd w:val="clear" w:color="auto" w:fill="FFFFFF"/>
               </w:rPr>
-              <w:t>[Address LH2]</w:t>
+              <w:t>[Address Contact LH2]</w:t>
             </w:r>
           </w:p>
           <w:p>
@@ -1702,7 +1702,7 @@
                 <w:b/>
                 <w:shd w:val="clear" w:color="auto" w:fill="FFFFFF"/>
               </w:rPr>
-              <w:t>[Mobile No LH2]</w:t>
+              <w:t/>
             </w:r>
           </w:p>
         </w:tc>
@@ -1816,23 +1816,23 @@
                 <w:b/>
                 <w:shd w:val="clear" w:color="auto" w:fill="FFFFFF"/>
               </w:rPr>
-              <w:t>[Address LH3]</w:t>
-            </w:r>
-          </w:p>
-          <w:p>
-            <w:pPr>
-              <w:rPr>
-                <w:rFonts w:ascii="Arial" w:hAnsi="Arial" w:cs="Arial"/>
-                <w:b/>
-              </w:rPr>
-            </w:pPr>
-            <w:r>
-              <w:rPr>
-                <w:rFonts w:ascii="Arial" w:hAnsi="Arial" w:cs="Arial"/>
-                <w:b/>
-                <w:shd w:val="clear" w:color="auto" w:fill="FFFFFF"/>
-              </w:rPr>
-              <w:t>[Mobile No LH3]</w:t>
+              <w:t>[Address Contact LH3]</w:t>
+            </w:r>
+          </w:p>
+          <w:p>
+            <w:pPr>
+              <w:rPr>
+                <w:rFonts w:ascii="Arial" w:hAnsi="Arial" w:cs="Arial"/>
+                <w:b/>
+              </w:rPr>
+            </w:pPr>
+            <w:r>
+              <w:rPr>
+                <w:rFonts w:ascii="Arial" w:hAnsi="Arial" w:cs="Arial"/>
+                <w:b/>
+                <w:shd w:val="clear" w:color="auto" w:fill="FFFFFF"/>
+              </w:rPr>
+              <w:t/>
             </w:r>
           </w:p>
         </w:tc>
@@ -1939,23 +1939,23 @@
                 <w:b/>
                 <w:shd w:val="clear" w:color="auto" w:fill="FFFFFF"/>
               </w:rPr>
-              <w:t>[Address LH4]</w:t>
-            </w:r>
-          </w:p>
-          <w:p>
-            <w:pPr>
-              <w:rPr>
-                <w:rFonts w:ascii="Arial" w:hAnsi="Arial" w:cs="Arial"/>
-                <w:b/>
-              </w:rPr>
-            </w:pPr>
-            <w:r>
-              <w:rPr>
-                <w:rFonts w:ascii="Arial" w:hAnsi="Arial" w:cs="Arial"/>
-                <w:b/>
-                <w:shd w:val="clear" w:color="auto" w:fill="FFFFFF"/>
-              </w:rPr>
-              <w:t>[Mobile No LH4]</w:t>
+              <w:t>[Address Contact LH4]</w:t>
+            </w:r>
+          </w:p>
+          <w:p>
+            <w:pPr>
+              <w:rPr>
+                <w:rFonts w:ascii="Arial" w:hAnsi="Arial" w:cs="Arial"/>
+                <w:b/>
+              </w:rPr>
+            </w:pPr>
+            <w:r>
+              <w:rPr>
+                <w:rFonts w:ascii="Arial" w:hAnsi="Arial" w:cs="Arial"/>
+                <w:b/>
+                <w:shd w:val="clear" w:color="auto" w:fill="FFFFFF"/>
+              </w:rPr>
+              <w:t/>
             </w:r>
           </w:p>
         </w:tc>
@@ -2062,23 +2062,23 @@
                 <w:b/>
                 <w:shd w:val="clear" w:color="auto" w:fill="FFFFFF"/>
               </w:rPr>
-              <w:t>[Address LH5]</w:t>
-            </w:r>
-          </w:p>
-          <w:p>
-            <w:pPr>
-              <w:rPr>
-                <w:rFonts w:ascii="Arial" w:hAnsi="Arial" w:cs="Arial"/>
-                <w:b/>
-              </w:rPr>
-            </w:pPr>
-            <w:r>
-              <w:rPr>
-                <w:rFonts w:ascii="Arial" w:hAnsi="Arial" w:cs="Arial"/>
-                <w:b/>
-                <w:shd w:val="clear" w:color="auto" w:fill="FFFFFF"/>
-              </w:rPr>
-              <w:t>[Mobile No LH5]</w:t>
+              <w:t>[Address Contact LH5]</w:t>
+            </w:r>
+          </w:p>
+          <w:p>
+            <w:pPr>
+              <w:rPr>
+                <w:rFonts w:ascii="Arial" w:hAnsi="Arial" w:cs="Arial"/>
+                <w:b/>
+              </w:rPr>
+            </w:pPr>
+            <w:r>
+              <w:rPr>
+                <w:rFonts w:ascii="Arial" w:hAnsi="Arial" w:cs="Arial"/>
+                <w:b/>
+                <w:shd w:val="clear" w:color="auto" w:fill="FFFFFF"/>
+              </w:rPr>
+              <w:t/>
             </w:r>
           </w:p>
         </w:tc>
@@ -2212,15 +2212,15 @@
                 <w:b/>
                 <w:shd w:val="clear" w:color="auto" w:fill="FFFFFF"/>
               </w:rPr>
-              <w:t>[Address LH6</w:t>
-            </w:r>
-            <w:r>
-              <w:rPr>
-                <w:rFonts w:ascii="Arial" w:hAnsi="Arial" w:cs="Arial"/>
-                <w:b/>
-                <w:shd w:val="clear" w:color="auto" w:fill="FFFFFF"/>
-              </w:rPr>
-              <w:t>]</w:t>
+              <w:t>[Address Contact LH6]</w:t>
+            </w:r>
+            <w:r>
+              <w:rPr>
+                <w:rFonts w:ascii="Arial" w:hAnsi="Arial" w:cs="Arial"/>
+                <w:b/>
+                <w:shd w:val="clear" w:color="auto" w:fill="FFFFFF"/>
+              </w:rPr>
+              <w:t/>
             </w:r>
           </w:p>
           <w:p>
@@ -2389,15 +2389,15 @@
                 <w:b/>
                 <w:shd w:val="clear" w:color="auto" w:fill="FFFFFF"/>
               </w:rPr>
-              <w:t>[Address LH7</w:t>
-            </w:r>
-            <w:r>
-              <w:rPr>
-                <w:rFonts w:ascii="Arial" w:hAnsi="Arial" w:cs="Arial"/>
-                <w:b/>
-                <w:shd w:val="clear" w:color="auto" w:fill="FFFFFF"/>
-              </w:rPr>
-              <w:t>]</w:t>
+              <w:t>[Address Contact LH7]</w:t>
+            </w:r>
+            <w:r>
+              <w:rPr>
+                <w:rFonts w:ascii="Arial" w:hAnsi="Arial" w:cs="Arial"/>
+                <w:b/>
+                <w:shd w:val="clear" w:color="auto" w:fill="FFFFFF"/>
+              </w:rPr>
+              <w:t/>
             </w:r>
           </w:p>
           <w:p>
@@ -2565,15 +2565,15 @@
                 <w:b/>
                 <w:shd w:val="clear" w:color="auto" w:fill="FFFFFF"/>
               </w:rPr>
-              <w:t>[Address LH8</w:t>
-            </w:r>
-            <w:r>
-              <w:rPr>
-                <w:rFonts w:ascii="Arial" w:hAnsi="Arial" w:cs="Arial"/>
-                <w:b/>
-                <w:shd w:val="clear" w:color="auto" w:fill="FFFFFF"/>
-              </w:rPr>
-              <w:t>]</w:t>
+              <w:t>[Address Contact LH8]</w:t>
+            </w:r>
+            <w:r>
+              <w:rPr>
+                <w:rFonts w:ascii="Arial" w:hAnsi="Arial" w:cs="Arial"/>
+                <w:b/>
+                <w:shd w:val="clear" w:color="auto" w:fill="FFFFFF"/>
+              </w:rPr>
+              <w:t/>
             </w:r>
           </w:p>
           <w:p>
@@ -2749,15 +2749,15 @@
                 <w:b/>
                 <w:shd w:val="clear" w:color="auto" w:fill="FFFFFF"/>
               </w:rPr>
-              <w:t>[Address LH9</w:t>
-            </w:r>
-            <w:r>
-              <w:rPr>
-                <w:rFonts w:ascii="Arial" w:hAnsi="Arial" w:cs="Arial"/>
-                <w:b/>
-                <w:shd w:val="clear" w:color="auto" w:fill="FFFFFF"/>
-              </w:rPr>
-              <w:t>]</w:t>
+              <w:t>[Address Contact LH9]</w:t>
+            </w:r>
+            <w:r>
+              <w:rPr>
+                <w:rFonts w:ascii="Arial" w:hAnsi="Arial" w:cs="Arial"/>
+                <w:b/>
+                <w:shd w:val="clear" w:color="auto" w:fill="FFFFFF"/>
+              </w:rPr>
+              <w:t/>
             </w:r>
           </w:p>
           <w:p>
@@ -2925,15 +2925,15 @@
                 <w:b/>
                 <w:shd w:val="clear" w:color="auto" w:fill="FFFFFF"/>
               </w:rPr>
-              <w:t>[Address LH10</w:t>
-            </w:r>
-            <w:r>
-              <w:rPr>
-                <w:rFonts w:ascii="Arial" w:hAnsi="Arial" w:cs="Arial"/>
-                <w:b/>
-                <w:shd w:val="clear" w:color="auto" w:fill="FFFFFF"/>
-              </w:rPr>
-              <w:t>]</w:t>
+              <w:t>[Address Contact LH10]</w:t>
+            </w:r>
+            <w:r>
+              <w:rPr>
+                <w:rFonts w:ascii="Arial" w:hAnsi="Arial" w:cs="Arial"/>
+                <w:b/>
+                <w:shd w:val="clear" w:color="auto" w:fill="FFFFFF"/>
+              </w:rPr>
+              <w:t/>
             </w:r>
           </w:p>
           <w:p>

</xml_diff>